<commit_message>
finished import phase spark
</commit_message>
<xml_diff>
--- a/Spark(3rd_delivery)/ProcessSpark.docx
+++ b/Spark(3rd_delivery)/ProcessSpark.docx
@@ -12,7 +12,7 @@
           <w:lang w:val="en-US"/>
         </w:rPr>
       </w:pPr>
-      <w:bookmarkStart w:name="_MON_1729939488" w:id="0"/>
+      <w:bookmarkStart w:id="0" w:name="_MON_1729939488"/>
       <w:bookmarkEnd w:id="0"/>
       <w:r>
         <w:rPr>
@@ -146,15 +146,7 @@
           <w:szCs w:val="32"/>
           <w:lang w:val="en-US"/>
         </w:rPr>
-        <w:t xml:space="preserve"> into csv using an online tool and we modified the csv using Excel formatting the columns and removing/adding attributes (for example we have added the email attribute to the authors by generating it coherently with their name, or we have eliminated some attributes for simplicity)</w:t>
-      </w:r>
-      <w:r>
-        <w:rPr>
-          <w:sz w:val="32"/>
-          <w:szCs w:val="32"/>
-          <w:lang w:val="en-US"/>
-        </w:rPr>
-        <w:t>.</w:t>
+        <w:t xml:space="preserve"> into csv using an online tool and we modified the csv using Excel formatting the columns and removing/adding attributes (for example we have added the email attribute to the authors by generating it coherently with their name, or we have eliminated some attributes for simplicity).</w:t>
       </w:r>
     </w:p>
     <w:p>
@@ -184,8 +176,18 @@
           <w:szCs w:val="32"/>
           <w:lang w:val="en-US"/>
         </w:rPr>
-        <w:t>table more important for the db</w:t>
-      </w:r>
+        <w:t xml:space="preserve">table more important for the </w:t>
+      </w:r>
+      <w:proofErr w:type="spellStart"/>
+      <w:r>
+        <w:rPr>
+          <w:sz w:val="32"/>
+          <w:szCs w:val="32"/>
+          <w:lang w:val="en-US"/>
+        </w:rPr>
+        <w:t>db</w:t>
+      </w:r>
+      <w:proofErr w:type="spellEnd"/>
       <w:r>
         <w:rPr>
           <w:sz w:val="32"/>
@@ -234,6 +236,7 @@
         </w:rPr>
         <w:t xml:space="preserve">For convenience, since we already have the csv files with the headers, we directly imported them into </w:t>
       </w:r>
+      <w:proofErr w:type="spellStart"/>
       <w:r>
         <w:rPr>
           <w:sz w:val="32"/>
@@ -242,6 +245,7 @@
         </w:rPr>
         <w:t>dataframes</w:t>
       </w:r>
+      <w:proofErr w:type="spellEnd"/>
       <w:r>
         <w:rPr>
           <w:sz w:val="32"/>
@@ -250,6 +254,7 @@
         </w:rPr>
         <w:t xml:space="preserve"> (and not into </w:t>
       </w:r>
+      <w:proofErr w:type="spellStart"/>
       <w:r>
         <w:rPr>
           <w:sz w:val="32"/>
@@ -258,6 +263,7 @@
         </w:rPr>
         <w:t>rdd</w:t>
       </w:r>
+      <w:proofErr w:type="spellEnd"/>
       <w:r>
         <w:rPr>
           <w:sz w:val="32"/>
@@ -272,32 +278,13 @@
           <w:szCs w:val="32"/>
           <w:lang w:val="en-US"/>
         </w:rPr>
-        <w:t>, e</w:t>
-      </w:r>
-      <w:r>
-        <w:rPr>
-          <w:sz w:val="32"/>
-          <w:szCs w:val="32"/>
-          <w:lang w:val="en-US"/>
-        </w:rPr>
-        <w:t>verything has been tested by printing schema and some examples of tables.</w:t>
-      </w:r>
-    </w:p>
-    <w:p>
-      <w:pPr>
-        <w:pStyle w:val="Normal"/>
-        <w:ind w:left="0"/>
-        <w:rPr>
-          <w:sz w:val="32"/>
-          <w:szCs w:val="32"/>
-          <w:lang w:val="en-US"/>
-        </w:rPr>
-      </w:pPr>
+        <w:t>, everything has been tested by printing schema and some examples of tables.</w:t>
+      </w:r>
     </w:p>
     <w:sectPr>
       <w:headerReference w:type="default" r:id="rId8"/>
       <w:footerReference w:type="default" r:id="rId9"/>
-      <w:pgSz w:w="11906" w:h="16838" w:orient="portrait"/>
+      <w:pgSz w:w="11906" w:h="16838"/>
       <w:pgMar w:top="720" w:right="720" w:bottom="720" w:left="720" w:header="708" w:footer="708" w:gutter="0"/>
       <w:cols w:space="708"/>
       <w:docGrid w:linePitch="360"/>
@@ -587,7 +574,7 @@
         <w:ind w:left="720" w:hanging="360"/>
       </w:pPr>
       <w:rPr>
-        <w:rFonts w:hint="default" w:ascii="Symbol" w:hAnsi="Symbol"/>
+        <w:rFonts w:ascii="Symbol" w:hAnsi="Symbol" w:hint="default"/>
       </w:rPr>
     </w:lvl>
     <w:lvl w:ilvl="1" w:tplc="08090003" w:tentative="1">
@@ -599,7 +586,7 @@
         <w:ind w:left="1440" w:hanging="360"/>
       </w:pPr>
       <w:rPr>
-        <w:rFonts w:hint="default" w:ascii="Courier New" w:hAnsi="Courier New" w:cs="Courier New"/>
+        <w:rFonts w:ascii="Courier New" w:hAnsi="Courier New" w:cs="Courier New" w:hint="default"/>
       </w:rPr>
     </w:lvl>
     <w:lvl w:ilvl="2" w:tplc="08090005" w:tentative="1">
@@ -611,7 +598,7 @@
         <w:ind w:left="2160" w:hanging="360"/>
       </w:pPr>
       <w:rPr>
-        <w:rFonts w:hint="default" w:ascii="Wingdings" w:hAnsi="Wingdings"/>
+        <w:rFonts w:ascii="Wingdings" w:hAnsi="Wingdings" w:hint="default"/>
       </w:rPr>
     </w:lvl>
     <w:lvl w:ilvl="3" w:tplc="08090001" w:tentative="1">
@@ -623,7 +610,7 @@
         <w:ind w:left="2880" w:hanging="360"/>
       </w:pPr>
       <w:rPr>
-        <w:rFonts w:hint="default" w:ascii="Symbol" w:hAnsi="Symbol"/>
+        <w:rFonts w:ascii="Symbol" w:hAnsi="Symbol" w:hint="default"/>
       </w:rPr>
     </w:lvl>
     <w:lvl w:ilvl="4" w:tplc="08090003" w:tentative="1">
@@ -635,7 +622,7 @@
         <w:ind w:left="3600" w:hanging="360"/>
       </w:pPr>
       <w:rPr>
-        <w:rFonts w:hint="default" w:ascii="Courier New" w:hAnsi="Courier New" w:cs="Courier New"/>
+        <w:rFonts w:ascii="Courier New" w:hAnsi="Courier New" w:cs="Courier New" w:hint="default"/>
       </w:rPr>
     </w:lvl>
     <w:lvl w:ilvl="5" w:tplc="08090005" w:tentative="1">
@@ -647,7 +634,7 @@
         <w:ind w:left="4320" w:hanging="360"/>
       </w:pPr>
       <w:rPr>
-        <w:rFonts w:hint="default" w:ascii="Wingdings" w:hAnsi="Wingdings"/>
+        <w:rFonts w:ascii="Wingdings" w:hAnsi="Wingdings" w:hint="default"/>
       </w:rPr>
     </w:lvl>
     <w:lvl w:ilvl="6" w:tplc="08090001" w:tentative="1">
@@ -659,7 +646,7 @@
         <w:ind w:left="5040" w:hanging="360"/>
       </w:pPr>
       <w:rPr>
-        <w:rFonts w:hint="default" w:ascii="Symbol" w:hAnsi="Symbol"/>
+        <w:rFonts w:ascii="Symbol" w:hAnsi="Symbol" w:hint="default"/>
       </w:rPr>
     </w:lvl>
     <w:lvl w:ilvl="7" w:tplc="08090003" w:tentative="1">
@@ -671,7 +658,7 @@
         <w:ind w:left="5760" w:hanging="360"/>
       </w:pPr>
       <w:rPr>
-        <w:rFonts w:hint="default" w:ascii="Courier New" w:hAnsi="Courier New" w:cs="Courier New"/>
+        <w:rFonts w:ascii="Courier New" w:hAnsi="Courier New" w:cs="Courier New" w:hint="default"/>
       </w:rPr>
     </w:lvl>
     <w:lvl w:ilvl="8" w:tplc="08090005" w:tentative="1">
@@ -683,7 +670,7 @@
         <w:ind w:left="6480" w:hanging="360"/>
       </w:pPr>
       <w:rPr>
-        <w:rFonts w:hint="default" w:ascii="Wingdings" w:hAnsi="Wingdings"/>
+        <w:rFonts w:ascii="Wingdings" w:hAnsi="Wingdings" w:hint="default"/>
       </w:rPr>
     </w:lvl>
   </w:abstractNum>
@@ -700,7 +687,7 @@
         <w:ind w:left="720" w:hanging="360"/>
       </w:pPr>
       <w:rPr>
-        <w:rFonts w:hint="default" w:ascii="Symbol" w:hAnsi="Symbol"/>
+        <w:rFonts w:ascii="Symbol" w:hAnsi="Symbol" w:hint="default"/>
       </w:rPr>
     </w:lvl>
     <w:lvl w:ilvl="1" w:tplc="08090003" w:tentative="1">
@@ -712,7 +699,7 @@
         <w:ind w:left="1440" w:hanging="360"/>
       </w:pPr>
       <w:rPr>
-        <w:rFonts w:hint="default" w:ascii="Courier New" w:hAnsi="Courier New" w:cs="Courier New"/>
+        <w:rFonts w:ascii="Courier New" w:hAnsi="Courier New" w:cs="Courier New" w:hint="default"/>
       </w:rPr>
     </w:lvl>
     <w:lvl w:ilvl="2" w:tplc="08090005" w:tentative="1">
@@ -724,7 +711,7 @@
         <w:ind w:left="2160" w:hanging="360"/>
       </w:pPr>
       <w:rPr>
-        <w:rFonts w:hint="default" w:ascii="Wingdings" w:hAnsi="Wingdings"/>
+        <w:rFonts w:ascii="Wingdings" w:hAnsi="Wingdings" w:hint="default"/>
       </w:rPr>
     </w:lvl>
     <w:lvl w:ilvl="3" w:tplc="08090001" w:tentative="1">
@@ -736,7 +723,7 @@
         <w:ind w:left="2880" w:hanging="360"/>
       </w:pPr>
       <w:rPr>
-        <w:rFonts w:hint="default" w:ascii="Symbol" w:hAnsi="Symbol"/>
+        <w:rFonts w:ascii="Symbol" w:hAnsi="Symbol" w:hint="default"/>
       </w:rPr>
     </w:lvl>
     <w:lvl w:ilvl="4" w:tplc="08090003" w:tentative="1">
@@ -748,7 +735,7 @@
         <w:ind w:left="3600" w:hanging="360"/>
       </w:pPr>
       <w:rPr>
-        <w:rFonts w:hint="default" w:ascii="Courier New" w:hAnsi="Courier New" w:cs="Courier New"/>
+        <w:rFonts w:ascii="Courier New" w:hAnsi="Courier New" w:cs="Courier New" w:hint="default"/>
       </w:rPr>
     </w:lvl>
     <w:lvl w:ilvl="5" w:tplc="08090005" w:tentative="1">
@@ -760,7 +747,7 @@
         <w:ind w:left="4320" w:hanging="360"/>
       </w:pPr>
       <w:rPr>
-        <w:rFonts w:hint="default" w:ascii="Wingdings" w:hAnsi="Wingdings"/>
+        <w:rFonts w:ascii="Wingdings" w:hAnsi="Wingdings" w:hint="default"/>
       </w:rPr>
     </w:lvl>
     <w:lvl w:ilvl="6" w:tplc="08090001" w:tentative="1">
@@ -772,7 +759,7 @@
         <w:ind w:left="5040" w:hanging="360"/>
       </w:pPr>
       <w:rPr>
-        <w:rFonts w:hint="default" w:ascii="Symbol" w:hAnsi="Symbol"/>
+        <w:rFonts w:ascii="Symbol" w:hAnsi="Symbol" w:hint="default"/>
       </w:rPr>
     </w:lvl>
     <w:lvl w:ilvl="7" w:tplc="08090003" w:tentative="1">
@@ -784,7 +771,7 @@
         <w:ind w:left="5760" w:hanging="360"/>
       </w:pPr>
       <w:rPr>
-        <w:rFonts w:hint="default" w:ascii="Courier New" w:hAnsi="Courier New" w:cs="Courier New"/>
+        <w:rFonts w:ascii="Courier New" w:hAnsi="Courier New" w:cs="Courier New" w:hint="default"/>
       </w:rPr>
     </w:lvl>
     <w:lvl w:ilvl="8" w:tplc="08090005" w:tentative="1">
@@ -796,7 +783,7 @@
         <w:ind w:left="6480" w:hanging="360"/>
       </w:pPr>
       <w:rPr>
-        <w:rFonts w:hint="default" w:ascii="Wingdings" w:hAnsi="Wingdings"/>
+        <w:rFonts w:ascii="Wingdings" w:hAnsi="Wingdings" w:hint="default"/>
       </w:rPr>
     </w:lvl>
   </w:abstractNum>
@@ -812,7 +799,7 @@
         <w:ind w:left="720" w:hanging="360"/>
       </w:pPr>
       <w:rPr>
-        <w:rFonts w:hint="default" w:ascii="Calibri" w:hAnsi="Calibri" w:cs="Calibri" w:eastAsiaTheme="minorHAnsi"/>
+        <w:rFonts w:ascii="Calibri" w:eastAsiaTheme="minorHAnsi" w:hAnsi="Calibri" w:cs="Calibri" w:hint="default"/>
       </w:rPr>
     </w:lvl>
     <w:lvl w:ilvl="1" w:tplc="04100003">
@@ -824,7 +811,7 @@
         <w:ind w:left="1440" w:hanging="360"/>
       </w:pPr>
       <w:rPr>
-        <w:rFonts w:hint="default" w:ascii="Courier New" w:hAnsi="Courier New" w:cs="Courier New"/>
+        <w:rFonts w:ascii="Courier New" w:hAnsi="Courier New" w:cs="Courier New" w:hint="default"/>
       </w:rPr>
     </w:lvl>
     <w:lvl w:ilvl="2" w:tplc="04100005" w:tentative="1">
@@ -836,7 +823,7 @@
         <w:ind w:left="2160" w:hanging="360"/>
       </w:pPr>
       <w:rPr>
-        <w:rFonts w:hint="default" w:ascii="Wingdings" w:hAnsi="Wingdings"/>
+        <w:rFonts w:ascii="Wingdings" w:hAnsi="Wingdings" w:hint="default"/>
       </w:rPr>
     </w:lvl>
     <w:lvl w:ilvl="3" w:tplc="04100001" w:tentative="1">
@@ -848,7 +835,7 @@
         <w:ind w:left="2880" w:hanging="360"/>
       </w:pPr>
       <w:rPr>
-        <w:rFonts w:hint="default" w:ascii="Symbol" w:hAnsi="Symbol"/>
+        <w:rFonts w:ascii="Symbol" w:hAnsi="Symbol" w:hint="default"/>
       </w:rPr>
     </w:lvl>
     <w:lvl w:ilvl="4" w:tplc="04100003" w:tentative="1">
@@ -860,7 +847,7 @@
         <w:ind w:left="3600" w:hanging="360"/>
       </w:pPr>
       <w:rPr>
-        <w:rFonts w:hint="default" w:ascii="Courier New" w:hAnsi="Courier New" w:cs="Courier New"/>
+        <w:rFonts w:ascii="Courier New" w:hAnsi="Courier New" w:cs="Courier New" w:hint="default"/>
       </w:rPr>
     </w:lvl>
     <w:lvl w:ilvl="5" w:tplc="04100005" w:tentative="1">
@@ -872,7 +859,7 @@
         <w:ind w:left="4320" w:hanging="360"/>
       </w:pPr>
       <w:rPr>
-        <w:rFonts w:hint="default" w:ascii="Wingdings" w:hAnsi="Wingdings"/>
+        <w:rFonts w:ascii="Wingdings" w:hAnsi="Wingdings" w:hint="default"/>
       </w:rPr>
     </w:lvl>
     <w:lvl w:ilvl="6" w:tplc="04100001" w:tentative="1">
@@ -884,7 +871,7 @@
         <w:ind w:left="5040" w:hanging="360"/>
       </w:pPr>
       <w:rPr>
-        <w:rFonts w:hint="default" w:ascii="Symbol" w:hAnsi="Symbol"/>
+        <w:rFonts w:ascii="Symbol" w:hAnsi="Symbol" w:hint="default"/>
       </w:rPr>
     </w:lvl>
     <w:lvl w:ilvl="7" w:tplc="04100003" w:tentative="1">
@@ -896,7 +883,7 @@
         <w:ind w:left="5760" w:hanging="360"/>
       </w:pPr>
       <w:rPr>
-        <w:rFonts w:hint="default" w:ascii="Courier New" w:hAnsi="Courier New" w:cs="Courier New"/>
+        <w:rFonts w:ascii="Courier New" w:hAnsi="Courier New" w:cs="Courier New" w:hint="default"/>
       </w:rPr>
     </w:lvl>
     <w:lvl w:ilvl="8" w:tplc="04100005" w:tentative="1">
@@ -908,7 +895,7 @@
         <w:ind w:left="6480" w:hanging="360"/>
       </w:pPr>
       <w:rPr>
-        <w:rFonts w:hint="default" w:ascii="Wingdings" w:hAnsi="Wingdings"/>
+        <w:rFonts w:ascii="Wingdings" w:hAnsi="Wingdings" w:hint="default"/>
       </w:rPr>
     </w:lvl>
   </w:abstractNum>
@@ -924,7 +911,7 @@
         <w:ind w:left="1776" w:hanging="360"/>
       </w:pPr>
       <w:rPr>
-        <w:rFonts w:hint="default" w:ascii="Calibri" w:hAnsi="Calibri" w:cs="Calibri" w:eastAsiaTheme="minorHAnsi"/>
+        <w:rFonts w:ascii="Calibri" w:eastAsiaTheme="minorHAnsi" w:hAnsi="Calibri" w:cs="Calibri" w:hint="default"/>
       </w:rPr>
     </w:lvl>
     <w:lvl w:ilvl="1" w:tplc="04100003" w:tentative="1">
@@ -936,7 +923,7 @@
         <w:ind w:left="2496" w:hanging="360"/>
       </w:pPr>
       <w:rPr>
-        <w:rFonts w:hint="default" w:ascii="Courier New" w:hAnsi="Courier New" w:cs="Courier New"/>
+        <w:rFonts w:ascii="Courier New" w:hAnsi="Courier New" w:cs="Courier New" w:hint="default"/>
       </w:rPr>
     </w:lvl>
     <w:lvl w:ilvl="2" w:tplc="04100005" w:tentative="1">
@@ -948,7 +935,7 @@
         <w:ind w:left="3216" w:hanging="360"/>
       </w:pPr>
       <w:rPr>
-        <w:rFonts w:hint="default" w:ascii="Wingdings" w:hAnsi="Wingdings"/>
+        <w:rFonts w:ascii="Wingdings" w:hAnsi="Wingdings" w:hint="default"/>
       </w:rPr>
     </w:lvl>
     <w:lvl w:ilvl="3" w:tplc="04100001" w:tentative="1">
@@ -960,7 +947,7 @@
         <w:ind w:left="3936" w:hanging="360"/>
       </w:pPr>
       <w:rPr>
-        <w:rFonts w:hint="default" w:ascii="Symbol" w:hAnsi="Symbol"/>
+        <w:rFonts w:ascii="Symbol" w:hAnsi="Symbol" w:hint="default"/>
       </w:rPr>
     </w:lvl>
     <w:lvl w:ilvl="4" w:tplc="04100003" w:tentative="1">
@@ -972,7 +959,7 @@
         <w:ind w:left="4656" w:hanging="360"/>
       </w:pPr>
       <w:rPr>
-        <w:rFonts w:hint="default" w:ascii="Courier New" w:hAnsi="Courier New" w:cs="Courier New"/>
+        <w:rFonts w:ascii="Courier New" w:hAnsi="Courier New" w:cs="Courier New" w:hint="default"/>
       </w:rPr>
     </w:lvl>
     <w:lvl w:ilvl="5" w:tplc="04100005" w:tentative="1">
@@ -984,7 +971,7 @@
         <w:ind w:left="5376" w:hanging="360"/>
       </w:pPr>
       <w:rPr>
-        <w:rFonts w:hint="default" w:ascii="Wingdings" w:hAnsi="Wingdings"/>
+        <w:rFonts w:ascii="Wingdings" w:hAnsi="Wingdings" w:hint="default"/>
       </w:rPr>
     </w:lvl>
     <w:lvl w:ilvl="6" w:tplc="04100001" w:tentative="1">
@@ -996,7 +983,7 @@
         <w:ind w:left="6096" w:hanging="360"/>
       </w:pPr>
       <w:rPr>
-        <w:rFonts w:hint="default" w:ascii="Symbol" w:hAnsi="Symbol"/>
+        <w:rFonts w:ascii="Symbol" w:hAnsi="Symbol" w:hint="default"/>
       </w:rPr>
     </w:lvl>
     <w:lvl w:ilvl="7" w:tplc="04100003" w:tentative="1">
@@ -1008,7 +995,7 @@
         <w:ind w:left="6816" w:hanging="360"/>
       </w:pPr>
       <w:rPr>
-        <w:rFonts w:hint="default" w:ascii="Courier New" w:hAnsi="Courier New" w:cs="Courier New"/>
+        <w:rFonts w:ascii="Courier New" w:hAnsi="Courier New" w:cs="Courier New" w:hint="default"/>
       </w:rPr>
     </w:lvl>
     <w:lvl w:ilvl="8" w:tplc="04100005" w:tentative="1">
@@ -1020,7 +1007,7 @@
         <w:ind w:left="7536" w:hanging="360"/>
       </w:pPr>
       <w:rPr>
-        <w:rFonts w:hint="default" w:ascii="Wingdings" w:hAnsi="Wingdings"/>
+        <w:rFonts w:ascii="Wingdings" w:hAnsi="Wingdings" w:hint="default"/>
       </w:rPr>
     </w:lvl>
   </w:abstractNum>
@@ -1123,7 +1110,7 @@
         <w:ind w:left="720" w:hanging="360"/>
       </w:pPr>
       <w:rPr>
-        <w:rFonts w:hint="default" w:ascii="Symbol" w:hAnsi="Symbol"/>
+        <w:rFonts w:ascii="Symbol" w:hAnsi="Symbol" w:hint="default"/>
       </w:rPr>
     </w:lvl>
     <w:lvl w:ilvl="1" w:tplc="4EAEC474">
@@ -1135,7 +1122,7 @@
         <w:ind w:left="1440" w:hanging="360"/>
       </w:pPr>
       <w:rPr>
-        <w:rFonts w:hint="default" w:ascii="Courier New" w:hAnsi="Courier New"/>
+        <w:rFonts w:ascii="Courier New" w:hAnsi="Courier New" w:hint="default"/>
       </w:rPr>
     </w:lvl>
     <w:lvl w:ilvl="2" w:tplc="396AFF7C">
@@ -1147,7 +1134,7 @@
         <w:ind w:left="2160" w:hanging="360"/>
       </w:pPr>
       <w:rPr>
-        <w:rFonts w:hint="default" w:ascii="Wingdings" w:hAnsi="Wingdings"/>
+        <w:rFonts w:ascii="Wingdings" w:hAnsi="Wingdings" w:hint="default"/>
       </w:rPr>
     </w:lvl>
     <w:lvl w:ilvl="3" w:tplc="DC0655EA">
@@ -1159,7 +1146,7 @@
         <w:ind w:left="2880" w:hanging="360"/>
       </w:pPr>
       <w:rPr>
-        <w:rFonts w:hint="default" w:ascii="Symbol" w:hAnsi="Symbol"/>
+        <w:rFonts w:ascii="Symbol" w:hAnsi="Symbol" w:hint="default"/>
       </w:rPr>
     </w:lvl>
     <w:lvl w:ilvl="4" w:tplc="8598781A">
@@ -1171,7 +1158,7 @@
         <w:ind w:left="3600" w:hanging="360"/>
       </w:pPr>
       <w:rPr>
-        <w:rFonts w:hint="default" w:ascii="Courier New" w:hAnsi="Courier New"/>
+        <w:rFonts w:ascii="Courier New" w:hAnsi="Courier New" w:hint="default"/>
       </w:rPr>
     </w:lvl>
     <w:lvl w:ilvl="5" w:tplc="0CC40CC2">
@@ -1183,7 +1170,7 @@
         <w:ind w:left="4320" w:hanging="360"/>
       </w:pPr>
       <w:rPr>
-        <w:rFonts w:hint="default" w:ascii="Wingdings" w:hAnsi="Wingdings"/>
+        <w:rFonts w:ascii="Wingdings" w:hAnsi="Wingdings" w:hint="default"/>
       </w:rPr>
     </w:lvl>
     <w:lvl w:ilvl="6" w:tplc="D4CE8C6C">
@@ -1195,7 +1182,7 @@
         <w:ind w:left="5040" w:hanging="360"/>
       </w:pPr>
       <w:rPr>
-        <w:rFonts w:hint="default" w:ascii="Symbol" w:hAnsi="Symbol"/>
+        <w:rFonts w:ascii="Symbol" w:hAnsi="Symbol" w:hint="default"/>
       </w:rPr>
     </w:lvl>
     <w:lvl w:ilvl="7" w:tplc="76B8D6D2">
@@ -1207,7 +1194,7 @@
         <w:ind w:left="5760" w:hanging="360"/>
       </w:pPr>
       <w:rPr>
-        <w:rFonts w:hint="default" w:ascii="Courier New" w:hAnsi="Courier New"/>
+        <w:rFonts w:ascii="Courier New" w:hAnsi="Courier New" w:hint="default"/>
       </w:rPr>
     </w:lvl>
     <w:lvl w:ilvl="8" w:tplc="F73AFF66">
@@ -1219,7 +1206,7 @@
         <w:ind w:left="6480" w:hanging="360"/>
       </w:pPr>
       <w:rPr>
-        <w:rFonts w:hint="default" w:ascii="Wingdings" w:hAnsi="Wingdings"/>
+        <w:rFonts w:ascii="Wingdings" w:hAnsi="Wingdings" w:hint="default"/>
       </w:rPr>
     </w:lvl>
   </w:abstractNum>
@@ -1236,7 +1223,7 @@
         <w:ind w:left="720" w:hanging="360"/>
       </w:pPr>
       <w:rPr>
-        <w:rFonts w:hint="default" w:ascii="Symbol" w:hAnsi="Symbol"/>
+        <w:rFonts w:ascii="Symbol" w:hAnsi="Symbol" w:hint="default"/>
       </w:rPr>
     </w:lvl>
     <w:lvl w:ilvl="1" w:tplc="08090003" w:tentative="1">
@@ -1248,7 +1235,7 @@
         <w:ind w:left="1440" w:hanging="360"/>
       </w:pPr>
       <w:rPr>
-        <w:rFonts w:hint="default" w:ascii="Courier New" w:hAnsi="Courier New" w:cs="Courier New"/>
+        <w:rFonts w:ascii="Courier New" w:hAnsi="Courier New" w:cs="Courier New" w:hint="default"/>
       </w:rPr>
     </w:lvl>
     <w:lvl w:ilvl="2" w:tplc="08090005" w:tentative="1">
@@ -1260,7 +1247,7 @@
         <w:ind w:left="2160" w:hanging="360"/>
       </w:pPr>
       <w:rPr>
-        <w:rFonts w:hint="default" w:ascii="Wingdings" w:hAnsi="Wingdings"/>
+        <w:rFonts w:ascii="Wingdings" w:hAnsi="Wingdings" w:hint="default"/>
       </w:rPr>
     </w:lvl>
     <w:lvl w:ilvl="3" w:tplc="08090001" w:tentative="1">
@@ -1272,7 +1259,7 @@
         <w:ind w:left="2880" w:hanging="360"/>
       </w:pPr>
       <w:rPr>
-        <w:rFonts w:hint="default" w:ascii="Symbol" w:hAnsi="Symbol"/>
+        <w:rFonts w:ascii="Symbol" w:hAnsi="Symbol" w:hint="default"/>
       </w:rPr>
     </w:lvl>
     <w:lvl w:ilvl="4" w:tplc="08090003" w:tentative="1">
@@ -1284,7 +1271,7 @@
         <w:ind w:left="3600" w:hanging="360"/>
       </w:pPr>
       <w:rPr>
-        <w:rFonts w:hint="default" w:ascii="Courier New" w:hAnsi="Courier New" w:cs="Courier New"/>
+        <w:rFonts w:ascii="Courier New" w:hAnsi="Courier New" w:cs="Courier New" w:hint="default"/>
       </w:rPr>
     </w:lvl>
     <w:lvl w:ilvl="5" w:tplc="08090005" w:tentative="1">
@@ -1296,7 +1283,7 @@
         <w:ind w:left="4320" w:hanging="360"/>
       </w:pPr>
       <w:rPr>
-        <w:rFonts w:hint="default" w:ascii="Wingdings" w:hAnsi="Wingdings"/>
+        <w:rFonts w:ascii="Wingdings" w:hAnsi="Wingdings" w:hint="default"/>
       </w:rPr>
     </w:lvl>
     <w:lvl w:ilvl="6" w:tplc="08090001" w:tentative="1">
@@ -1308,7 +1295,7 @@
         <w:ind w:left="5040" w:hanging="360"/>
       </w:pPr>
       <w:rPr>
-        <w:rFonts w:hint="default" w:ascii="Symbol" w:hAnsi="Symbol"/>
+        <w:rFonts w:ascii="Symbol" w:hAnsi="Symbol" w:hint="default"/>
       </w:rPr>
     </w:lvl>
     <w:lvl w:ilvl="7" w:tplc="08090003" w:tentative="1">
@@ -1320,7 +1307,7 @@
         <w:ind w:left="5760" w:hanging="360"/>
       </w:pPr>
       <w:rPr>
-        <w:rFonts w:hint="default" w:ascii="Courier New" w:hAnsi="Courier New" w:cs="Courier New"/>
+        <w:rFonts w:ascii="Courier New" w:hAnsi="Courier New" w:cs="Courier New" w:hint="default"/>
       </w:rPr>
     </w:lvl>
     <w:lvl w:ilvl="8" w:tplc="08090005" w:tentative="1">
@@ -1332,7 +1319,7 @@
         <w:ind w:left="6480" w:hanging="360"/>
       </w:pPr>
       <w:rPr>
-        <w:rFonts w:hint="default" w:ascii="Wingdings" w:hAnsi="Wingdings"/>
+        <w:rFonts w:ascii="Wingdings" w:hAnsi="Wingdings" w:hint="default"/>
       </w:rPr>
     </w:lvl>
   </w:abstractNum>
@@ -1523,7 +1510,7 @@
         <w:ind w:left="720" w:hanging="360"/>
       </w:pPr>
       <w:rPr>
-        <w:rFonts w:hint="default" w:ascii="Menlo" w:hAnsi="Menlo" w:eastAsia="Menlo" w:cs="Menlo"/>
+        <w:rFonts w:ascii="Menlo" w:eastAsia="Menlo" w:hAnsi="Menlo" w:cs="Menlo" w:hint="default"/>
       </w:rPr>
     </w:lvl>
     <w:lvl w:ilvl="1" w:tplc="04100003" w:tentative="1">
@@ -1535,7 +1522,7 @@
         <w:ind w:left="1440" w:hanging="360"/>
       </w:pPr>
       <w:rPr>
-        <w:rFonts w:hint="default" w:ascii="Courier New" w:hAnsi="Courier New" w:cs="Courier New"/>
+        <w:rFonts w:ascii="Courier New" w:hAnsi="Courier New" w:cs="Courier New" w:hint="default"/>
       </w:rPr>
     </w:lvl>
     <w:lvl w:ilvl="2" w:tplc="04100005" w:tentative="1">
@@ -1547,7 +1534,7 @@
         <w:ind w:left="2160" w:hanging="360"/>
       </w:pPr>
       <w:rPr>
-        <w:rFonts w:hint="default" w:ascii="Wingdings" w:hAnsi="Wingdings"/>
+        <w:rFonts w:ascii="Wingdings" w:hAnsi="Wingdings" w:hint="default"/>
       </w:rPr>
     </w:lvl>
     <w:lvl w:ilvl="3" w:tplc="04100001" w:tentative="1">
@@ -1559,7 +1546,7 @@
         <w:ind w:left="2880" w:hanging="360"/>
       </w:pPr>
       <w:rPr>
-        <w:rFonts w:hint="default" w:ascii="Symbol" w:hAnsi="Symbol"/>
+        <w:rFonts w:ascii="Symbol" w:hAnsi="Symbol" w:hint="default"/>
       </w:rPr>
     </w:lvl>
     <w:lvl w:ilvl="4" w:tplc="04100003" w:tentative="1">
@@ -1571,7 +1558,7 @@
         <w:ind w:left="3600" w:hanging="360"/>
       </w:pPr>
       <w:rPr>
-        <w:rFonts w:hint="default" w:ascii="Courier New" w:hAnsi="Courier New" w:cs="Courier New"/>
+        <w:rFonts w:ascii="Courier New" w:hAnsi="Courier New" w:cs="Courier New" w:hint="default"/>
       </w:rPr>
     </w:lvl>
     <w:lvl w:ilvl="5" w:tplc="04100005" w:tentative="1">
@@ -1583,7 +1570,7 @@
         <w:ind w:left="4320" w:hanging="360"/>
       </w:pPr>
       <w:rPr>
-        <w:rFonts w:hint="default" w:ascii="Wingdings" w:hAnsi="Wingdings"/>
+        <w:rFonts w:ascii="Wingdings" w:hAnsi="Wingdings" w:hint="default"/>
       </w:rPr>
     </w:lvl>
     <w:lvl w:ilvl="6" w:tplc="04100001" w:tentative="1">
@@ -1595,7 +1582,7 @@
         <w:ind w:left="5040" w:hanging="360"/>
       </w:pPr>
       <w:rPr>
-        <w:rFonts w:hint="default" w:ascii="Symbol" w:hAnsi="Symbol"/>
+        <w:rFonts w:ascii="Symbol" w:hAnsi="Symbol" w:hint="default"/>
       </w:rPr>
     </w:lvl>
     <w:lvl w:ilvl="7" w:tplc="04100003" w:tentative="1">
@@ -1607,7 +1594,7 @@
         <w:ind w:left="5760" w:hanging="360"/>
       </w:pPr>
       <w:rPr>
-        <w:rFonts w:hint="default" w:ascii="Courier New" w:hAnsi="Courier New" w:cs="Courier New"/>
+        <w:rFonts w:ascii="Courier New" w:hAnsi="Courier New" w:cs="Courier New" w:hint="default"/>
       </w:rPr>
     </w:lvl>
     <w:lvl w:ilvl="8" w:tplc="04100005" w:tentative="1">
@@ -1619,7 +1606,7 @@
         <w:ind w:left="6480" w:hanging="360"/>
       </w:pPr>
       <w:rPr>
-        <w:rFonts w:hint="default" w:ascii="Wingdings" w:hAnsi="Wingdings"/>
+        <w:rFonts w:ascii="Wingdings" w:hAnsi="Wingdings" w:hint="default"/>
       </w:rPr>
     </w:lvl>
   </w:abstractNum>
@@ -1753,7 +1740,7 @@
   <w:docDefaults>
     <w:rPrDefault>
       <w:rPr>
-        <w:rFonts w:asciiTheme="minorHAnsi" w:hAnsiTheme="minorHAnsi" w:eastAsiaTheme="minorHAnsi" w:cstheme="minorBidi"/>
+        <w:rFonts w:asciiTheme="minorHAnsi" w:eastAsiaTheme="minorHAnsi" w:hAnsiTheme="minorHAnsi" w:cstheme="minorBidi"/>
         <w:sz w:val="22"/>
         <w:szCs w:val="22"/>
         <w:lang w:val="it-IT" w:eastAsia="en-US" w:bidi="ar-SA"/>
@@ -1768,14 +1755,14 @@
   <w:latentStyles w:defLockedState="0" w:defUIPriority="99" w:defSemiHidden="0" w:defUnhideWhenUsed="0" w:defQFormat="0" w:count="376">
     <w:lsdException w:name="Normal" w:uiPriority="0" w:qFormat="1"/>
     <w:lsdException w:name="heading 1" w:uiPriority="9" w:qFormat="1"/>
-    <w:lsdException w:name="heading 2" w:uiPriority="9" w:semiHidden="1" w:unhideWhenUsed="1" w:qFormat="1"/>
-    <w:lsdException w:name="heading 3" w:uiPriority="9" w:semiHidden="1" w:unhideWhenUsed="1" w:qFormat="1"/>
-    <w:lsdException w:name="heading 4" w:uiPriority="9" w:semiHidden="1" w:unhideWhenUsed="1" w:qFormat="1"/>
-    <w:lsdException w:name="heading 5" w:uiPriority="9" w:semiHidden="1" w:unhideWhenUsed="1" w:qFormat="1"/>
-    <w:lsdException w:name="heading 6" w:uiPriority="9" w:semiHidden="1" w:unhideWhenUsed="1" w:qFormat="1"/>
-    <w:lsdException w:name="heading 7" w:uiPriority="9" w:semiHidden="1" w:unhideWhenUsed="1" w:qFormat="1"/>
-    <w:lsdException w:name="heading 8" w:uiPriority="9" w:semiHidden="1" w:unhideWhenUsed="1" w:qFormat="1"/>
-    <w:lsdException w:name="heading 9" w:uiPriority="9" w:semiHidden="1" w:unhideWhenUsed="1" w:qFormat="1"/>
+    <w:lsdException w:name="heading 2" w:semiHidden="1" w:uiPriority="9" w:unhideWhenUsed="1" w:qFormat="1"/>
+    <w:lsdException w:name="heading 3" w:semiHidden="1" w:uiPriority="9" w:unhideWhenUsed="1" w:qFormat="1"/>
+    <w:lsdException w:name="heading 4" w:semiHidden="1" w:uiPriority="9" w:unhideWhenUsed="1" w:qFormat="1"/>
+    <w:lsdException w:name="heading 5" w:semiHidden="1" w:uiPriority="9" w:unhideWhenUsed="1" w:qFormat="1"/>
+    <w:lsdException w:name="heading 6" w:semiHidden="1" w:uiPriority="9" w:unhideWhenUsed="1" w:qFormat="1"/>
+    <w:lsdException w:name="heading 7" w:semiHidden="1" w:uiPriority="9" w:unhideWhenUsed="1" w:qFormat="1"/>
+    <w:lsdException w:name="heading 8" w:semiHidden="1" w:uiPriority="9" w:unhideWhenUsed="1" w:qFormat="1"/>
+    <w:lsdException w:name="heading 9" w:semiHidden="1" w:uiPriority="9" w:unhideWhenUsed="1" w:qFormat="1"/>
     <w:lsdException w:name="index 1" w:semiHidden="1" w:unhideWhenUsed="1"/>
     <w:lsdException w:name="index 2" w:semiHidden="1" w:unhideWhenUsed="1"/>
     <w:lsdException w:name="index 3" w:semiHidden="1" w:unhideWhenUsed="1"/>
@@ -1785,22 +1772,22 @@
     <w:lsdException w:name="index 7" w:semiHidden="1" w:unhideWhenUsed="1"/>
     <w:lsdException w:name="index 8" w:semiHidden="1" w:unhideWhenUsed="1"/>
     <w:lsdException w:name="index 9" w:semiHidden="1" w:unhideWhenUsed="1"/>
-    <w:lsdException w:name="toc 1" w:uiPriority="39" w:semiHidden="1" w:unhideWhenUsed="1"/>
-    <w:lsdException w:name="toc 2" w:uiPriority="39" w:semiHidden="1" w:unhideWhenUsed="1"/>
-    <w:lsdException w:name="toc 3" w:uiPriority="39" w:semiHidden="1" w:unhideWhenUsed="1"/>
-    <w:lsdException w:name="toc 4" w:uiPriority="39" w:semiHidden="1" w:unhideWhenUsed="1"/>
-    <w:lsdException w:name="toc 5" w:uiPriority="39" w:semiHidden="1" w:unhideWhenUsed="1"/>
-    <w:lsdException w:name="toc 6" w:uiPriority="39" w:semiHidden="1" w:unhideWhenUsed="1"/>
-    <w:lsdException w:name="toc 7" w:uiPriority="39" w:semiHidden="1" w:unhideWhenUsed="1"/>
-    <w:lsdException w:name="toc 8" w:uiPriority="39" w:semiHidden="1" w:unhideWhenUsed="1"/>
-    <w:lsdException w:name="toc 9" w:uiPriority="39" w:semiHidden="1" w:unhideWhenUsed="1"/>
+    <w:lsdException w:name="toc 1" w:semiHidden="1" w:uiPriority="39" w:unhideWhenUsed="1"/>
+    <w:lsdException w:name="toc 2" w:semiHidden="1" w:uiPriority="39" w:unhideWhenUsed="1"/>
+    <w:lsdException w:name="toc 3" w:semiHidden="1" w:uiPriority="39" w:unhideWhenUsed="1"/>
+    <w:lsdException w:name="toc 4" w:semiHidden="1" w:uiPriority="39" w:unhideWhenUsed="1"/>
+    <w:lsdException w:name="toc 5" w:semiHidden="1" w:uiPriority="39" w:unhideWhenUsed="1"/>
+    <w:lsdException w:name="toc 6" w:semiHidden="1" w:uiPriority="39" w:unhideWhenUsed="1"/>
+    <w:lsdException w:name="toc 7" w:semiHidden="1" w:uiPriority="39" w:unhideWhenUsed="1"/>
+    <w:lsdException w:name="toc 8" w:semiHidden="1" w:uiPriority="39" w:unhideWhenUsed="1"/>
+    <w:lsdException w:name="toc 9" w:semiHidden="1" w:uiPriority="39" w:unhideWhenUsed="1"/>
     <w:lsdException w:name="Normal Indent" w:semiHidden="1" w:unhideWhenUsed="1"/>
     <w:lsdException w:name="footnote text" w:semiHidden="1" w:unhideWhenUsed="1"/>
     <w:lsdException w:name="annotation text" w:semiHidden="1" w:unhideWhenUsed="1"/>
     <w:lsdException w:name="header" w:semiHidden="1" w:unhideWhenUsed="1"/>
     <w:lsdException w:name="footer" w:semiHidden="1" w:unhideWhenUsed="1"/>
     <w:lsdException w:name="index heading" w:semiHidden="1" w:unhideWhenUsed="1"/>
-    <w:lsdException w:name="caption" w:uiPriority="35" w:semiHidden="1" w:unhideWhenUsed="1" w:qFormat="1"/>
+    <w:lsdException w:name="caption" w:semiHidden="1" w:uiPriority="35" w:unhideWhenUsed="1" w:qFormat="1"/>
     <w:lsdException w:name="table of figures" w:semiHidden="1" w:unhideWhenUsed="1"/>
     <w:lsdException w:name="envelope address" w:semiHidden="1" w:unhideWhenUsed="1"/>
     <w:lsdException w:name="envelope return" w:semiHidden="1" w:unhideWhenUsed="1"/>
@@ -1831,7 +1818,7 @@
     <w:lsdException w:name="Title" w:uiPriority="10" w:qFormat="1"/>
     <w:lsdException w:name="Closing" w:semiHidden="1" w:unhideWhenUsed="1"/>
     <w:lsdException w:name="Signature" w:semiHidden="1" w:unhideWhenUsed="1"/>
-    <w:lsdException w:name="Default Paragraph Font" w:uiPriority="1" w:semiHidden="1" w:unhideWhenUsed="1"/>
+    <w:lsdException w:name="Default Paragraph Font" w:semiHidden="1" w:uiPriority="1" w:unhideWhenUsed="1"/>
     <w:lsdException w:name="Body Text" w:semiHidden="1" w:unhideWhenUsed="1"/>
     <w:lsdException w:name="Body Text Indent" w:semiHidden="1" w:unhideWhenUsed="1"/>
     <w:lsdException w:name="List Continue" w:semiHidden="1" w:unhideWhenUsed="1"/>
@@ -2031,8 +2018,8 @@
     <w:lsdException w:name="Subtle Reference" w:uiPriority="31" w:qFormat="1"/>
     <w:lsdException w:name="Intense Reference" w:uiPriority="32" w:qFormat="1"/>
     <w:lsdException w:name="Book Title" w:uiPriority="33" w:qFormat="1"/>
-    <w:lsdException w:name="Bibliography" w:uiPriority="37" w:semiHidden="1" w:unhideWhenUsed="1"/>
-    <w:lsdException w:name="TOC Heading" w:uiPriority="39" w:semiHidden="1" w:unhideWhenUsed="1" w:qFormat="1"/>
+    <w:lsdException w:name="Bibliography" w:semiHidden="1" w:uiPriority="37" w:unhideWhenUsed="1"/>
+    <w:lsdException w:name="TOC Heading" w:semiHidden="1" w:uiPriority="39" w:unhideWhenUsed="1" w:qFormat="1"/>
     <w:lsdException w:name="Plain Table 1" w:uiPriority="41"/>
     <w:lsdException w:name="Plain Table 2" w:uiPriority="42"/>
     <w:lsdException w:name="Plain Table 3" w:uiPriority="43"/>
@@ -2143,17 +2130,17 @@
     <w:lsdException w:name="Unresolved Mention" w:semiHidden="1" w:unhideWhenUsed="1"/>
     <w:lsdException w:name="Smart Link" w:semiHidden="1" w:unhideWhenUsed="1"/>
   </w:latentStyles>
-  <w:style w:type="paragraph" w:styleId="Normal" w:default="1">
+  <w:style w:type="paragraph" w:default="1" w:styleId="Normal">
     <w:name w:val="Normal"/>
     <w:qFormat/>
   </w:style>
-  <w:style w:type="character" w:styleId="DefaultParagraphFont" w:default="1">
+  <w:style w:type="character" w:default="1" w:styleId="DefaultParagraphFont">
     <w:name w:val="Default Paragraph Font"/>
     <w:uiPriority w:val="1"/>
     <w:semiHidden/>
     <w:unhideWhenUsed/>
   </w:style>
-  <w:style w:type="table" w:styleId="TableNormal" w:default="1">
+  <w:style w:type="table" w:default="1" w:styleId="TableNormal">
     <w:name w:val="Normal Table"/>
     <w:uiPriority w:val="99"/>
     <w:semiHidden/>
@@ -2168,7 +2155,7 @@
       </w:tblCellMar>
     </w:tblPr>
   </w:style>
-  <w:style w:type="numbering" w:styleId="NoList" w:default="1">
+  <w:style w:type="numbering" w:default="1" w:styleId="NoList">
     <w:name w:val="No List"/>
     <w:uiPriority w:val="99"/>
     <w:semiHidden/>
@@ -2195,12 +2182,12 @@
     </w:pPr>
     <w:tblPr>
       <w:tblBorders>
-        <w:top w:val="single" w:color="000000" w:themeColor="text1" w:sz="4" w:space="0"/>
-        <w:left w:val="single" w:color="000000" w:themeColor="text1" w:sz="4" w:space="0"/>
-        <w:bottom w:val="single" w:color="000000" w:themeColor="text1" w:sz="4" w:space="0"/>
-        <w:right w:val="single" w:color="000000" w:themeColor="text1" w:sz="4" w:space="0"/>
-        <w:insideH w:val="single" w:color="000000" w:themeColor="text1" w:sz="4" w:space="0"/>
-        <w:insideV w:val="single" w:color="000000" w:themeColor="text1" w:sz="4" w:space="0"/>
+        <w:top w:val="single" w:sz="4" w:space="0" w:color="000000" w:themeColor="text1"/>
+        <w:left w:val="single" w:sz="4" w:space="0" w:color="000000" w:themeColor="text1"/>
+        <w:bottom w:val="single" w:sz="4" w:space="0" w:color="000000" w:themeColor="text1"/>
+        <w:right w:val="single" w:sz="4" w:space="0" w:color="000000" w:themeColor="text1"/>
+        <w:insideH w:val="single" w:sz="4" w:space="0" w:color="000000" w:themeColor="text1"/>
+        <w:insideV w:val="single" w:sz="4" w:space="0" w:color="000000" w:themeColor="text1"/>
       </w:tblBorders>
     </w:tblPr>
   </w:style>
@@ -2233,20 +2220,20 @@
       <w:spacing w:after="0" w:line="240" w:lineRule="auto"/>
     </w:pPr>
     <w:rPr>
-      <w:rFonts w:ascii="Courier New" w:hAnsi="Courier New" w:eastAsia="Times New Roman" w:cs="Courier New"/>
+      <w:rFonts w:ascii="Courier New" w:eastAsia="Times New Roman" w:hAnsi="Courier New" w:cs="Courier New"/>
       <w:sz w:val="20"/>
       <w:szCs w:val="20"/>
       <w:lang w:val="en-AU" w:eastAsia="en-GB"/>
     </w:rPr>
   </w:style>
-  <w:style w:type="character" w:styleId="HTMLPreformattedChar" w:customStyle="1">
+  <w:style w:type="character" w:customStyle="1" w:styleId="HTMLPreformattedChar">
     <w:name w:val="HTML Preformatted Char"/>
     <w:basedOn w:val="DefaultParagraphFont"/>
     <w:link w:val="HTMLPreformatted"/>
     <w:uiPriority w:val="99"/>
     <w:rsid w:val="00371D23"/>
     <w:rPr>
-      <w:rFonts w:ascii="Courier New" w:hAnsi="Courier New" w:eastAsia="Times New Roman" w:cs="Courier New"/>
+      <w:rFonts w:ascii="Courier New" w:eastAsia="Times New Roman" w:hAnsi="Courier New" w:cs="Courier New"/>
       <w:sz w:val="20"/>
       <w:szCs w:val="20"/>
       <w:lang w:val="en-AU" w:eastAsia="en-GB"/>
@@ -2279,7 +2266,7 @@
       <w:szCs w:val="20"/>
     </w:rPr>
   </w:style>
-  <w:style w:type="character" w:styleId="CommentTextChar" w:customStyle="1">
+  <w:style w:type="character" w:customStyle="1" w:styleId="CommentTextChar">
     <w:name w:val="Comment Text Char"/>
     <w:basedOn w:val="DefaultParagraphFont"/>
     <w:link w:val="CommentText"/>
@@ -2304,7 +2291,7 @@
       <w:bCs/>
     </w:rPr>
   </w:style>
-  <w:style w:type="character" w:styleId="CommentSubjectChar" w:customStyle="1">
+  <w:style w:type="character" w:customStyle="1" w:styleId="CommentSubjectChar">
     <w:name w:val="Comment Subject Char"/>
     <w:basedOn w:val="CommentTextChar"/>
     <w:link w:val="CommentSubject"/>
@@ -2326,32 +2313,32 @@
     <w:unhideWhenUsed/>
     <w:rsid w:val="004C0C05"/>
     <w:rPr>
-      <w:rFonts w:ascii="Courier New" w:hAnsi="Courier New" w:eastAsia="Times New Roman" w:cs="Courier New"/>
+      <w:rFonts w:ascii="Courier New" w:eastAsia="Times New Roman" w:hAnsi="Courier New" w:cs="Courier New"/>
       <w:sz w:val="20"/>
       <w:szCs w:val="20"/>
     </w:rPr>
   </w:style>
-  <w:style w:type="character" w:styleId="lg-highlight-attr" w:customStyle="1">
+  <w:style w:type="character" w:customStyle="1" w:styleId="lg-highlight-attr">
     <w:name w:val="lg-highlight-attr"/>
     <w:basedOn w:val="DefaultParagraphFont"/>
     <w:rsid w:val="004C0C05"/>
   </w:style>
-  <w:style w:type="character" w:styleId="lg-highlight-title" w:customStyle="1">
+  <w:style w:type="character" w:customStyle="1" w:styleId="lg-highlight-title">
     <w:name w:val="lg-highlight-title"/>
     <w:basedOn w:val="DefaultParagraphFont"/>
     <w:rsid w:val="004C0C05"/>
   </w:style>
-  <w:style w:type="character" w:styleId="lg-highlight-string" w:customStyle="1">
+  <w:style w:type="character" w:customStyle="1" w:styleId="lg-highlight-string">
     <w:name w:val="lg-highlight-string"/>
     <w:basedOn w:val="DefaultParagraphFont"/>
     <w:rsid w:val="004C0C05"/>
   </w:style>
-  <w:style w:type="character" w:styleId="lg-highlight-number" w:customStyle="1">
+  <w:style w:type="character" w:customStyle="1" w:styleId="lg-highlight-number">
     <w:name w:val="lg-highlight-number"/>
     <w:basedOn w:val="DefaultParagraphFont"/>
     <w:rsid w:val="004C0C05"/>
   </w:style>
-  <w:style w:type="character" w:styleId="HeaderChar" w:customStyle="1">
+  <w:style w:type="character" w:customStyle="1" w:styleId="HeaderChar">
     <w:name w:val="Header Char"/>
     <w:basedOn w:val="DefaultParagraphFont"/>
     <w:link w:val="Header"/>
@@ -2371,7 +2358,7 @@
       <w:spacing w:after="0" w:line="240" w:lineRule="auto"/>
     </w:pPr>
   </w:style>
-  <w:style w:type="character" w:styleId="FooterChar" w:customStyle="1">
+  <w:style w:type="character" w:customStyle="1" w:styleId="FooterChar">
     <w:name w:val="Footer Char"/>
     <w:basedOn w:val="DefaultParagraphFont"/>
     <w:link w:val="Footer"/>

</xml_diff>